<commit_message>
Section editor UX: preview filled vars, revert/upload/export improvements
- Setup: mark template variables not used in this meeting's sections
- Section editor: textarea now shows preview_md (variables filled in)
- Section editor: revert uses template_preview_md so vars stay filled
- Section editor: remove provider dropdown, default to meeting's setup model
- Section editor: revert styled same size/color as generate, placed beside it
- SectionSourcePanel: rebuild upload UX with visible click target + pending file list
- Export: drop PDF download button
- DOCX render: strip preamble/meeting-dates cover from exports
- Refresh template-1 from updated Word file; migration 11 syncs all section_drafts
</commit_message>
<xml_diff>
--- a/server/templates/jkp/meeting-1.docx
+++ b/server/templates/jkp/meeting-1.docx
@@ -74,7 +74,7 @@
           <w:sz w:val="24"/>
           <w:szCs w:val="24"/>
         </w:rPr>
-        <w:t>&lt;date 1&gt;</w:t>
+        <w:t>&lt;</w:t>
       </w:r>
       <w:r>
         <w:rPr>
@@ -83,7 +83,7 @@
           <w:sz w:val="24"/>
           <w:szCs w:val="24"/>
         </w:rPr>
-        <w:t xml:space="preserve"> – </w:t>
+        <w:t xml:space="preserve">Meeting </w:t>
       </w:r>
       <w:r>
         <w:rPr>
@@ -92,7 +92,43 @@
           <w:sz w:val="24"/>
           <w:szCs w:val="24"/>
         </w:rPr>
-        <w:t>&lt;location&gt;</w:t>
+        <w:t>date 1&gt;</w:t>
+      </w:r>
+      <w:r>
+        <w:rPr>
+          <w:rFonts w:eastAsia="Times New Roman" w:cstheme="minorHAnsi"/>
+          <w:color w:val="494949"/>
+          <w:sz w:val="24"/>
+          <w:szCs w:val="24"/>
+        </w:rPr>
+        <w:t xml:space="preserve"> – </w:t>
+      </w:r>
+      <w:r>
+        <w:rPr>
+          <w:rFonts w:eastAsia="Times New Roman" w:cstheme="minorHAnsi"/>
+          <w:color w:val="494949"/>
+          <w:sz w:val="24"/>
+          <w:szCs w:val="24"/>
+        </w:rPr>
+        <w:t>&lt;</w:t>
+      </w:r>
+      <w:r>
+        <w:rPr>
+          <w:rFonts w:eastAsia="Times New Roman" w:cstheme="minorHAnsi"/>
+          <w:color w:val="494949"/>
+          <w:sz w:val="24"/>
+          <w:szCs w:val="24"/>
+        </w:rPr>
+        <w:t xml:space="preserve">Meeting date 1 </w:t>
+      </w:r>
+      <w:r>
+        <w:rPr>
+          <w:rFonts w:eastAsia="Times New Roman" w:cstheme="minorHAnsi"/>
+          <w:color w:val="494949"/>
+          <w:sz w:val="24"/>
+          <w:szCs w:val="24"/>
+        </w:rPr>
+        <w:t>location&gt;</w:t>
       </w:r>
     </w:p>
     <w:p>
@@ -114,7 +150,7 @@
           <w:sz w:val="24"/>
           <w:szCs w:val="24"/>
         </w:rPr>
-        <w:t>&lt;date 2&gt;</w:t>
+        <w:t>&lt;</w:t>
       </w:r>
       <w:r>
         <w:rPr>
@@ -123,7 +159,7 @@
           <w:sz w:val="24"/>
           <w:szCs w:val="24"/>
         </w:rPr>
-        <w:t xml:space="preserve"> (Approval of Final A/Cs)</w:t>
+        <w:t>Meeting date 2</w:t>
       </w:r>
       <w:r>
         <w:rPr>
@@ -132,7 +168,7 @@
           <w:sz w:val="24"/>
           <w:szCs w:val="24"/>
         </w:rPr>
-        <w:t xml:space="preserve"> </w:t>
+        <w:t>&gt;</w:t>
       </w:r>
       <w:r>
         <w:rPr>
@@ -141,7 +177,7 @@
           <w:sz w:val="24"/>
           <w:szCs w:val="24"/>
         </w:rPr>
-        <w:t>–</w:t>
+        <w:t xml:space="preserve"> </w:t>
       </w:r>
       <w:r>
         <w:rPr>
@@ -150,7 +186,7 @@
           <w:sz w:val="24"/>
           <w:szCs w:val="24"/>
         </w:rPr>
-        <w:t xml:space="preserve"> </w:t>
+        <w:t>(Approval of Final A/Cs)</w:t>
       </w:r>
       <w:r>
         <w:rPr>
@@ -159,7 +195,34 @@
           <w:sz w:val="24"/>
           <w:szCs w:val="24"/>
         </w:rPr>
-        <w:t>Mangarh</w:t>
+        <w:t xml:space="preserve"> </w:t>
+      </w:r>
+      <w:r>
+        <w:rPr>
+          <w:rFonts w:eastAsia="Times New Roman" w:cstheme="minorHAnsi"/>
+          <w:color w:val="494949"/>
+          <w:sz w:val="24"/>
+          <w:szCs w:val="24"/>
+        </w:rPr>
+        <w:t>–</w:t>
+      </w:r>
+      <w:r>
+        <w:rPr>
+          <w:rFonts w:eastAsia="Times New Roman" w:cstheme="minorHAnsi"/>
+          <w:color w:val="494949"/>
+          <w:sz w:val="24"/>
+          <w:szCs w:val="24"/>
+        </w:rPr>
+        <w:t xml:space="preserve"> </w:t>
+      </w:r>
+      <w:r>
+        <w:rPr>
+          <w:rFonts w:eastAsia="Times New Roman" w:cstheme="minorHAnsi"/>
+          <w:color w:val="494949"/>
+          <w:sz w:val="24"/>
+          <w:szCs w:val="24"/>
+        </w:rPr>
+        <w:t>&lt;Meeting date 2 location&gt;</w:t>
       </w:r>
     </w:p>
     <w:p>
@@ -181,7 +244,7 @@
           <w:sz w:val="24"/>
           <w:szCs w:val="24"/>
         </w:rPr>
-        <w:t>19</w:t>
+        <w:t xml:space="preserve">&lt;Meeting date 3&gt; </w:t>
       </w:r>
       <w:r>
         <w:rPr>
@@ -190,7 +253,7 @@
           <w:sz w:val="24"/>
           <w:szCs w:val="24"/>
         </w:rPr>
-        <w:t>-09</w:t>
+        <w:t>(Adoption of Final A/Cs)</w:t>
       </w:r>
       <w:r>
         <w:rPr>
@@ -199,7 +262,7 @@
           <w:sz w:val="24"/>
           <w:szCs w:val="24"/>
         </w:rPr>
-        <w:t>-</w:t>
+        <w:t xml:space="preserve"> </w:t>
       </w:r>
       <w:r>
         <w:rPr>
@@ -208,7 +271,7 @@
           <w:sz w:val="24"/>
           <w:szCs w:val="24"/>
         </w:rPr>
-        <w:t>201</w:t>
+        <w:t>–</w:t>
       </w:r>
       <w:r>
         <w:rPr>
@@ -217,7 +280,7 @@
           <w:sz w:val="24"/>
           <w:szCs w:val="24"/>
         </w:rPr>
-        <w:t>9</w:t>
+        <w:t xml:space="preserve"> </w:t>
       </w:r>
       <w:r>
         <w:rPr>
@@ -226,17 +289,21 @@
           <w:sz w:val="24"/>
           <w:szCs w:val="24"/>
         </w:rPr>
-        <w:t xml:space="preserve"> (Adoption of Final A/Cs)</w:t>
-      </w:r>
-      <w:r>
+        <w:t>&lt;Meeting date 3 location&gt;</w:t>
+      </w:r>
+    </w:p>
+    <w:p>
+      <w:pPr>
+        <w:spacing w:after="0" w:line="240" w:lineRule="auto"/>
+        <w:ind w:right="173"/>
+        <w:jc w:val="both"/>
         <w:rPr>
           <w:rFonts w:eastAsia="Times New Roman" w:cstheme="minorHAnsi"/>
           <w:color w:val="494949"/>
           <w:sz w:val="24"/>
           <w:szCs w:val="24"/>
         </w:rPr>
-        <w:t xml:space="preserve"> </w:t>
-      </w:r>
+      </w:pPr>
       <w:r>
         <w:rPr>
           <w:rFonts w:eastAsia="Times New Roman" w:cstheme="minorHAnsi"/>
@@ -244,17 +311,21 @@
           <w:sz w:val="24"/>
           <w:szCs w:val="24"/>
         </w:rPr>
-        <w:t>–</w:t>
-      </w:r>
-      <w:r>
+        <w:t>&lt;Meeting date 4&gt;– &lt;Meeting date 4 location&gt;</w:t>
+      </w:r>
+    </w:p>
+    <w:p>
+      <w:pPr>
+        <w:spacing w:after="0" w:line="240" w:lineRule="auto"/>
+        <w:ind w:right="173"/>
+        <w:jc w:val="both"/>
         <w:rPr>
           <w:rFonts w:eastAsia="Times New Roman" w:cstheme="minorHAnsi"/>
           <w:color w:val="494949"/>
           <w:sz w:val="24"/>
           <w:szCs w:val="24"/>
         </w:rPr>
-        <w:t xml:space="preserve"> Del</w:t>
-      </w:r>
+      </w:pPr>
       <w:r>
         <w:rPr>
           <w:rFonts w:eastAsia="Times New Roman" w:cstheme="minorHAnsi"/>
@@ -262,150 +333,7 @@
           <w:sz w:val="24"/>
           <w:szCs w:val="24"/>
         </w:rPr>
-        <w:t>hi</w:t>
-      </w:r>
-    </w:p>
-    <w:p>
-      <w:pPr>
-        <w:spacing w:after="0" w:line="240" w:lineRule="auto"/>
-        <w:ind w:right="173"/>
-        <w:jc w:val="both"/>
-        <w:rPr>
-          <w:rFonts w:eastAsia="Times New Roman" w:cstheme="minorHAnsi"/>
-          <w:color w:val="494949"/>
-          <w:sz w:val="24"/>
-          <w:szCs w:val="24"/>
-        </w:rPr>
-      </w:pPr>
-      <w:r>
-        <w:rPr>
-          <w:rFonts w:eastAsia="Times New Roman" w:cstheme="minorHAnsi"/>
-          <w:color w:val="494949"/>
-          <w:sz w:val="24"/>
-          <w:szCs w:val="24"/>
-        </w:rPr>
-        <w:t>07</w:t>
-      </w:r>
-      <w:r>
-        <w:rPr>
-          <w:rFonts w:eastAsia="Times New Roman" w:cstheme="minorHAnsi"/>
-          <w:color w:val="494949"/>
-          <w:sz w:val="24"/>
-          <w:szCs w:val="24"/>
-        </w:rPr>
-        <w:t>-12-201</w:t>
-      </w:r>
-      <w:r>
-        <w:rPr>
-          <w:rFonts w:eastAsia="Times New Roman" w:cstheme="minorHAnsi"/>
-          <w:color w:val="494949"/>
-          <w:sz w:val="24"/>
-          <w:szCs w:val="24"/>
-        </w:rPr>
-        <w:t>9</w:t>
-      </w:r>
-      <w:r>
-        <w:rPr>
-          <w:rFonts w:eastAsia="Times New Roman" w:cstheme="minorHAnsi"/>
-          <w:color w:val="494949"/>
-          <w:sz w:val="24"/>
-          <w:szCs w:val="24"/>
-        </w:rPr>
-        <w:t xml:space="preserve"> </w:t>
-      </w:r>
-      <w:r>
-        <w:rPr>
-          <w:rFonts w:eastAsia="Times New Roman" w:cstheme="minorHAnsi"/>
-          <w:color w:val="494949"/>
-          <w:sz w:val="24"/>
-          <w:szCs w:val="24"/>
-        </w:rPr>
-        <w:t>–</w:t>
-      </w:r>
-      <w:r>
-        <w:rPr>
-          <w:rFonts w:eastAsia="Times New Roman" w:cstheme="minorHAnsi"/>
-          <w:color w:val="494949"/>
-          <w:sz w:val="24"/>
-          <w:szCs w:val="24"/>
-        </w:rPr>
-        <w:t xml:space="preserve"> </w:t>
-      </w:r>
-      <w:r>
-        <w:rPr>
-          <w:rFonts w:eastAsia="Times New Roman" w:cstheme="minorHAnsi"/>
-          <w:color w:val="494949"/>
-          <w:sz w:val="24"/>
-          <w:szCs w:val="24"/>
-        </w:rPr>
-        <w:t>Delhi</w:t>
-      </w:r>
-    </w:p>
-    <w:p>
-      <w:pPr>
-        <w:spacing w:after="0" w:line="240" w:lineRule="auto"/>
-        <w:ind w:right="173"/>
-        <w:jc w:val="both"/>
-        <w:rPr>
-          <w:rFonts w:eastAsia="Times New Roman" w:cstheme="minorHAnsi"/>
-          <w:color w:val="494949"/>
-          <w:sz w:val="24"/>
-          <w:szCs w:val="24"/>
-        </w:rPr>
-      </w:pPr>
-      <w:r>
-        <w:rPr>
-          <w:rFonts w:eastAsia="Times New Roman" w:cstheme="minorHAnsi"/>
-          <w:color w:val="494949"/>
-          <w:sz w:val="24"/>
-          <w:szCs w:val="24"/>
-        </w:rPr>
-        <w:t>18</w:t>
-      </w:r>
-      <w:r>
-        <w:rPr>
-          <w:rFonts w:eastAsia="Times New Roman" w:cstheme="minorHAnsi"/>
-          <w:color w:val="494949"/>
-          <w:sz w:val="24"/>
-          <w:szCs w:val="24"/>
-        </w:rPr>
-        <w:t>-03-20</w:t>
-      </w:r>
-      <w:r>
-        <w:rPr>
-          <w:rFonts w:eastAsia="Times New Roman" w:cstheme="minorHAnsi"/>
-          <w:color w:val="494949"/>
-          <w:sz w:val="24"/>
-          <w:szCs w:val="24"/>
-        </w:rPr>
-        <w:t>20</w:t>
-      </w:r>
-      <w:r>
-        <w:rPr>
-          <w:rFonts w:eastAsia="Times New Roman" w:cstheme="minorHAnsi"/>
-          <w:color w:val="494949"/>
-          <w:sz w:val="24"/>
-          <w:szCs w:val="24"/>
-        </w:rPr>
-        <w:t xml:space="preserve"> </w:t>
-      </w:r>
-      <w:r>
-        <w:rPr>
-          <w:rFonts w:eastAsia="Times New Roman" w:cstheme="minorHAnsi"/>
-          <w:color w:val="494949"/>
-          <w:sz w:val="24"/>
-          <w:szCs w:val="24"/>
-        </w:rPr>
-        <w:t>–</w:t>
-      </w:r>
-      <w:r>
-        <w:rPr>
-          <w:rFonts w:eastAsia="Times New Roman" w:cstheme="minorHAnsi"/>
-          <w:color w:val="494949"/>
-          <w:sz w:val="24"/>
-          <w:szCs w:val="24"/>
-        </w:rPr>
-        <w:t xml:space="preserve"> Delhi</w:t>
+        <w:t>&lt;Meeting date 5&gt; – &lt;Meeting date 5 location&gt;</w:t>
       </w:r>
     </w:p>
     <w:p>
@@ -829,7 +757,7 @@
         <w:rPr>
           <w:sz w:val="24"/>
         </w:rPr>
-        <w:t>&lt;Trustee 1&gt;</w:t>
+        <w:t>&lt;Trustee 1 aka Managing Trustee&gt;</w:t>
       </w:r>
       <w:r>
         <w:rPr>
@@ -1191,7 +1119,7 @@
           <w:sz w:val="24"/>
           <w:szCs w:val="22"/>
         </w:rPr>
-        <w:t>&lt;Trustee 1&gt;</w:t>
+        <w:t>&lt;Trustee 1 aka Managing Trustee&gt;</w:t>
       </w:r>
       <w:r>
         <w:rPr>
@@ -1357,7 +1285,19 @@
         <w:rPr>
           <w:sz w:val="24"/>
         </w:rPr>
-        <w:t xml:space="preserve"> that donations were being collected for the Trust. He added saying that the idle funds at an opportune time can be invested in some profitable ventures so that the income can be pooled towards the fulfillment of </w:t>
+        <w:t xml:space="preserve"> that donations were being collected for the Trust. He added saying that the idle funds at an opportune time can be invested in some profitable ventures so that the income c</w:t>
+      </w:r>
+      <w:r>
+        <w:rPr>
+          <w:sz w:val="24"/>
+        </w:rPr>
+        <w:t>an be pooled towards the fulfil</w:t>
+      </w:r>
+      <w:r>
+        <w:rPr>
+          <w:sz w:val="24"/>
+        </w:rPr>
+        <w:t xml:space="preserve">ment of </w:t>
       </w:r>
       <w:r>
         <w:rPr>
@@ -1437,7 +1377,7 @@
           <w:sz w:val="24"/>
           <w:szCs w:val="24"/>
         </w:rPr>
-        <w:t>&lt;Trustee 1&gt;</w:t>
+        <w:t>&lt;Trustee 1 aka Managing Trustee&gt;</w:t>
       </w:r>
       <w:r>
         <w:rPr>
@@ -1887,7 +1827,6 @@
     <w:p>
       <w:pPr>
         <w:spacing w:after="0"/>
-        <w:jc w:val="both"/>
         <w:rPr>
           <w:sz w:val="24"/>
         </w:rPr>
@@ -1902,7 +1841,15 @@
         <w:rPr>
           <w:sz w:val="24"/>
         </w:rPr>
-        <w:t xml:space="preserve">, Chairperson brought to the notice of the Board that land needs </w:t>
+        <w:t>, Chairperson brought</w:t>
+      </w:r>
+      <w:bookmarkStart w:id="2" w:name="_GoBack"/>
+      <w:bookmarkEnd w:id="2"/>
+      <w:r>
+        <w:rPr>
+          <w:sz w:val="24"/>
+        </w:rPr>
+        <w:t xml:space="preserve"> to the notice of the Board that land needs </w:t>
       </w:r>
       <w:r>
         <w:rPr>
@@ -1938,131 +1885,14 @@
         <w:rPr>
           <w:sz w:val="24"/>
         </w:rPr>
-        <w:t xml:space="preserve">since The </w:t>
-      </w:r>
-      <w:r>
-        <w:rPr>
-          <w:sz w:val="24"/>
-        </w:rPr>
-        <w:t>Magnificent</w:t>
-      </w:r>
-      <w:r>
-        <w:rPr>
-          <w:sz w:val="24"/>
-        </w:rPr>
-        <w:t xml:space="preserve"> Bhakti Mandir </w:t>
-      </w:r>
-      <w:r>
-        <w:rPr>
-          <w:sz w:val="24"/>
-        </w:rPr>
-        <w:t xml:space="preserve">and Massive Bhakti Bhawan </w:t>
-      </w:r>
-      <w:r>
-        <w:rPr>
-          <w:sz w:val="24"/>
-        </w:rPr>
-        <w:t>have</w:t>
-      </w:r>
-      <w:r>
-        <w:rPr>
-          <w:sz w:val="24"/>
-        </w:rPr>
-        <w:t xml:space="preserve"> been inaugurated need has been felt f</w:t>
-      </w:r>
-      <w:r>
-        <w:rPr>
-          <w:sz w:val="24"/>
-        </w:rPr>
-        <w:t xml:space="preserve">or Guest </w:t>
-      </w:r>
-      <w:r>
-        <w:rPr>
-          <w:sz w:val="24"/>
-        </w:rPr>
-        <w:t>Rooms,</w:t>
-      </w:r>
-      <w:r>
-        <w:rPr>
-          <w:sz w:val="24"/>
-        </w:rPr>
-        <w:t xml:space="preserve"> </w:t>
-      </w:r>
-      <w:r>
-        <w:rPr>
-          <w:sz w:val="24"/>
-        </w:rPr>
-        <w:t xml:space="preserve">Rooms for Devotees, </w:t>
-      </w:r>
-      <w:r>
-        <w:rPr>
-          <w:sz w:val="24"/>
-        </w:rPr>
-        <w:t xml:space="preserve">Parking Area and </w:t>
-      </w:r>
-      <w:r>
-        <w:rPr>
-          <w:sz w:val="24"/>
-        </w:rPr>
-        <w:t>Garden with ampl</w:t>
-      </w:r>
-      <w:r>
-        <w:rPr>
-          <w:sz w:val="24"/>
-        </w:rPr>
-        <w:t>e space to acc</w:t>
-      </w:r>
-      <w:r>
-        <w:rPr>
-          <w:sz w:val="24"/>
-        </w:rPr>
-        <w:t>ommodate tourists and visitors</w:t>
-      </w:r>
-      <w:r>
-        <w:rPr>
-          <w:sz w:val="24"/>
-        </w:rPr>
-        <w:t>.</w:t>
-      </w:r>
-      <w:r>
-        <w:rPr>
-          <w:sz w:val="24"/>
-        </w:rPr>
-        <w:t xml:space="preserve"> Some of the plans and projects </w:t>
-      </w:r>
-      <w:r>
-        <w:rPr>
-          <w:sz w:val="24"/>
-        </w:rPr>
-        <w:t>consist</w:t>
-      </w:r>
-      <w:r>
-        <w:rPr>
-          <w:sz w:val="24"/>
-        </w:rPr>
-        <w:t xml:space="preserve"> of the upcoming Museum (a Heritage </w:t>
-      </w:r>
-      <w:r>
-        <w:rPr>
-          <w:sz w:val="24"/>
-        </w:rPr>
-        <w:t>Centre</w:t>
-      </w:r>
-      <w:r>
-        <w:rPr>
-          <w:sz w:val="24"/>
-        </w:rPr>
-        <w:t>), various exhibition and tableau setups, and a massive recreation park for visitors.</w:t>
-      </w:r>
-    </w:p>
-    <w:p>
-      <w:pPr>
-        <w:spacing w:after="0"/>
-        <w:jc w:val="both"/>
-        <w:rPr>
-          <w:sz w:val="24"/>
-        </w:rPr>
-      </w:pPr>
+        <w:t xml:space="preserve">since &lt;reasons for purchasing new land&gt; </w:t>
+      </w:r>
+      <w:r>
+        <w:rPr>
+          <w:sz w:val="24"/>
+        </w:rPr>
+        <w:br/>
+      </w:r>
     </w:p>
     <w:p>
       <w:pPr>
@@ -2479,7 +2309,14 @@
         <w:rPr>
           <w:sz w:val="24"/>
         </w:rPr>
-        <w:t xml:space="preserve">of any three of the following people - </w:t>
+        <w:t xml:space="preserve">of any </w:t>
+      </w:r>
+      <w:r>
+        <w:rPr>
+          <w:sz w:val="24"/>
+        </w:rPr>
+        <w:lastRenderedPageBreak/>
+        <w:t xml:space="preserve">three of the following people - </w:t>
       </w:r>
       <w:r>
         <w:rPr>
@@ -2663,7 +2500,7 @@
         <w:rPr>
           <w:sz w:val="24"/>
         </w:rPr>
-        <w:t>&lt;Trustee 1&gt;</w:t>
+        <w:t>&lt;Trustee 1 aka Managing Trustee&gt;</w:t>
       </w:r>
       <w:r>
         <w:rPr>
@@ -3283,7 +3120,7 @@
           <w:sz w:val="24"/>
           <w:szCs w:val="24"/>
         </w:rPr>
-        <w:t>&lt;Trustee 1&gt;</w:t>
+        <w:t>&lt;Trustee 1 aka Managing Trustee&gt;</w:t>
       </w:r>
       <w:r>
         <w:rPr>
@@ -3385,7 +3222,6 @@
           <w:sz w:val="24"/>
           <w:szCs w:val="24"/>
         </w:rPr>
-        <w:lastRenderedPageBreak/>
         <w:t xml:space="preserve">After discussion, the Board unanimously resolved as </w:t>
       </w:r>
       <w:r>
@@ -3423,6 +3259,7 @@
           <w:sz w:val="24"/>
           <w:szCs w:val="24"/>
         </w:rPr>
+        <w:lastRenderedPageBreak/>
         <w:t>“RESOLVED THAT</w:t>
       </w:r>
       <w:r>
@@ -3882,7 +3719,7 @@
           <w:sz w:val="24"/>
           <w:szCs w:val="24"/>
         </w:rPr>
-        <w:t>&lt;Trustee 1&gt;</w:t>
+        <w:t>&lt;Trustee 1 aka Managing Trustee&gt;</w:t>
       </w:r>
       <w:r>
         <w:rPr>
@@ -4221,39 +4058,45 @@
           <w:b/>
           <w:sz w:val="24"/>
         </w:rPr>
+        <w:t>“</w:t>
+      </w:r>
+      <w:r>
+        <w:rPr>
+          <w:b/>
+          <w:sz w:val="24"/>
+        </w:rPr>
+        <w:t>RESOLVED FURTHER THAT</w:t>
+      </w:r>
+      <w:r>
+        <w:rPr>
+          <w:sz w:val="24"/>
+        </w:rPr>
+        <w:t>,</w:t>
+      </w:r>
+      <w:r>
+        <w:rPr>
+          <w:sz w:val="24"/>
+        </w:rPr>
+        <w:t xml:space="preserve"> specific Power of Attorney (Vakalatnama) in lines of the aforesaid Power of Attorney (as approved by the meeting) be executed in his </w:t>
+      </w:r>
+      <w:r>
+        <w:rPr>
+          <w:sz w:val="24"/>
+        </w:rPr>
+        <w:t>favour</w:t>
+      </w:r>
+      <w:r>
+        <w:rPr>
+          <w:sz w:val="24"/>
+        </w:rPr>
+        <w:t xml:space="preserve"> for </w:t>
+      </w:r>
+      <w:r>
+        <w:rPr>
+          <w:sz w:val="24"/>
+        </w:rPr>
         <w:lastRenderedPageBreak/>
-        <w:t>“</w:t>
-      </w:r>
-      <w:r>
-        <w:rPr>
-          <w:b/>
-          <w:sz w:val="24"/>
-        </w:rPr>
-        <w:t>RESOLVED FURTHER THAT</w:t>
-      </w:r>
-      <w:r>
-        <w:rPr>
-          <w:sz w:val="24"/>
-        </w:rPr>
-        <w:t>,</w:t>
-      </w:r>
-      <w:r>
-        <w:rPr>
-          <w:sz w:val="24"/>
-        </w:rPr>
-        <w:t xml:space="preserve"> specific Power of Attorney (Vakalatnama) in lines of the aforesaid Power of Attorney (as approved by the meeting) be executed in his </w:t>
-      </w:r>
-      <w:r>
-        <w:rPr>
-          <w:sz w:val="24"/>
-        </w:rPr>
-        <w:t>favour</w:t>
-      </w:r>
-      <w:r>
-        <w:rPr>
-          <w:sz w:val="24"/>
-        </w:rPr>
-        <w:t xml:space="preserve"> for submission before the income-tax authority or the Appellate Tribunal, as the case may be, as and when required.</w:t>
+        <w:t>submission before the income-tax authority or the Appellate Tribunal, as the case may be, as and when required.</w:t>
       </w:r>
       <w:r>
         <w:rPr>
@@ -4409,7 +4252,7 @@
         <w:rPr>
           <w:sz w:val="24"/>
         </w:rPr>
-        <w:t>&lt;Trustee 1&gt;</w:t>
+        <w:t>&lt;Trustee 1 aka Managing Trustee&gt;</w:t>
       </w:r>
       <w:r>
         <w:rPr>
@@ -5059,73 +4902,82 @@
           <w:sz w:val="24"/>
           <w:szCs w:val="24"/>
         </w:rPr>
+        <w:t>“</w:t>
+      </w:r>
+      <w:r>
+        <w:rPr>
+          <w:rFonts w:asciiTheme="minorHAnsi" w:hAnsiTheme="minorHAnsi" w:cstheme="minorHAnsi"/>
+          <w:b/>
+          <w:bCs/>
+          <w:sz w:val="24"/>
+          <w:szCs w:val="24"/>
+        </w:rPr>
+        <w:t>RESOLVED THAT</w:t>
+      </w:r>
+      <w:r>
+        <w:rPr>
+          <w:rFonts w:asciiTheme="minorHAnsi" w:hAnsiTheme="minorHAnsi" w:cstheme="minorHAnsi"/>
+          <w:b/>
+          <w:bCs/>
+          <w:sz w:val="24"/>
+          <w:szCs w:val="24"/>
+        </w:rPr>
+        <w:t>,</w:t>
+      </w:r>
+      <w:r>
+        <w:rPr>
+          <w:rFonts w:asciiTheme="minorHAnsi" w:hAnsiTheme="minorHAnsi" w:cstheme="minorHAnsi"/>
+          <w:bCs/>
+          <w:sz w:val="24"/>
+          <w:szCs w:val="24"/>
+        </w:rPr>
+        <w:t xml:space="preserve"> that since one of the Trust’s </w:t>
+      </w:r>
+      <w:r>
+        <w:rPr>
+          <w:rFonts w:asciiTheme="minorHAnsi" w:hAnsiTheme="minorHAnsi" w:cstheme="minorHAnsi"/>
+          <w:bCs/>
+          <w:sz w:val="24"/>
+          <w:szCs w:val="24"/>
+        </w:rPr>
+        <w:t>objectives</w:t>
+      </w:r>
+      <w:r>
+        <w:rPr>
+          <w:rFonts w:asciiTheme="minorHAnsi" w:hAnsiTheme="minorHAnsi" w:cstheme="minorHAnsi"/>
+          <w:bCs/>
+          <w:sz w:val="24"/>
+          <w:szCs w:val="24"/>
+        </w:rPr>
+        <w:t xml:space="preserve"> is to help the poor and needy public</w:t>
+      </w:r>
+      <w:r>
+        <w:rPr>
+          <w:rFonts w:asciiTheme="minorHAnsi" w:hAnsiTheme="minorHAnsi" w:cstheme="minorHAnsi"/>
+          <w:bCs/>
+          <w:sz w:val="24"/>
+          <w:szCs w:val="24"/>
+        </w:rPr>
+        <w:t>,</w:t>
+      </w:r>
+      <w:r>
+        <w:rPr>
+          <w:rFonts w:asciiTheme="minorHAnsi" w:hAnsiTheme="minorHAnsi" w:cstheme="minorHAnsi"/>
+          <w:bCs/>
+          <w:sz w:val="24"/>
+          <w:szCs w:val="24"/>
+        </w:rPr>
+        <w:t xml:space="preserve"> especially by providing medical assistance, such financial medical assistance </w:t>
+      </w:r>
+      <w:r>
+        <w:rPr>
+          <w:rFonts w:asciiTheme="minorHAnsi" w:hAnsiTheme="minorHAnsi" w:cstheme="minorHAnsi"/>
+          <w:bCs/>
+          <w:sz w:val="24"/>
+          <w:szCs w:val="24"/>
+        </w:rPr>
         <w:lastRenderedPageBreak/>
-        <w:t>“</w:t>
-      </w:r>
-      <w:r>
-        <w:rPr>
-          <w:rFonts w:asciiTheme="minorHAnsi" w:hAnsiTheme="minorHAnsi" w:cstheme="minorHAnsi"/>
-          <w:b/>
-          <w:bCs/>
-          <w:sz w:val="24"/>
-          <w:szCs w:val="24"/>
-        </w:rPr>
-        <w:t>RESOLVED THAT</w:t>
-      </w:r>
-      <w:r>
-        <w:rPr>
-          <w:rFonts w:asciiTheme="minorHAnsi" w:hAnsiTheme="minorHAnsi" w:cstheme="minorHAnsi"/>
-          <w:b/>
-          <w:bCs/>
-          <w:sz w:val="24"/>
-          <w:szCs w:val="24"/>
-        </w:rPr>
-        <w:t>,</w:t>
-      </w:r>
-      <w:r>
-        <w:rPr>
-          <w:rFonts w:asciiTheme="minorHAnsi" w:hAnsiTheme="minorHAnsi" w:cstheme="minorHAnsi"/>
-          <w:bCs/>
-          <w:sz w:val="24"/>
-          <w:szCs w:val="24"/>
-        </w:rPr>
-        <w:t xml:space="preserve"> that since one of the Trust’s </w:t>
-      </w:r>
-      <w:r>
-        <w:rPr>
-          <w:rFonts w:asciiTheme="minorHAnsi" w:hAnsiTheme="minorHAnsi" w:cstheme="minorHAnsi"/>
-          <w:bCs/>
-          <w:sz w:val="24"/>
-          <w:szCs w:val="24"/>
-        </w:rPr>
-        <w:t>objectives</w:t>
-      </w:r>
-      <w:r>
-        <w:rPr>
-          <w:rFonts w:asciiTheme="minorHAnsi" w:hAnsiTheme="minorHAnsi" w:cstheme="minorHAnsi"/>
-          <w:bCs/>
-          <w:sz w:val="24"/>
-          <w:szCs w:val="24"/>
-        </w:rPr>
-        <w:t xml:space="preserve"> is to help the poor and needy public</w:t>
-      </w:r>
-      <w:r>
-        <w:rPr>
-          <w:rFonts w:asciiTheme="minorHAnsi" w:hAnsiTheme="minorHAnsi" w:cstheme="minorHAnsi"/>
-          <w:bCs/>
-          <w:sz w:val="24"/>
-          <w:szCs w:val="24"/>
-        </w:rPr>
-        <w:t>,</w:t>
-      </w:r>
-      <w:r>
-        <w:rPr>
-          <w:rFonts w:asciiTheme="minorHAnsi" w:hAnsiTheme="minorHAnsi" w:cstheme="minorHAnsi"/>
-          <w:bCs/>
-          <w:sz w:val="24"/>
-          <w:szCs w:val="24"/>
-        </w:rPr>
-        <w:t xml:space="preserve"> especially by providing medical assistance, such financial medical assistance requests shall be considered and if found genuine, assistance shall be provided to the patient and all its medical expenses hence shall be borne by the Trust.”</w:t>
+        <w:t>requests shall be considered and if found genuine, assistance shall be provided to the patient and all its medical expenses hence shall be borne by the Trust.”</w:t>
       </w:r>
     </w:p>
     <w:p>
@@ -5983,20 +5835,19 @@
         <w:rPr>
           <w:sz w:val="24"/>
         </w:rPr>
-        <w:t xml:space="preserve">Expenses incurred on </w:t>
-      </w:r>
-      <w:r>
-        <w:rPr>
-          <w:sz w:val="24"/>
-          <w:lang w:val="en-IN"/>
-        </w:rPr>
-        <w:t>Labour</w:t>
-      </w:r>
-      <w:r>
-        <w:rPr>
-          <w:sz w:val="24"/>
-        </w:rPr>
-        <w:t xml:space="preserve">; Agricultural work done; JCB and Tractor hired for digging and laser levelling work done and Purchase of MS Angles for Fencing Work were taken note of. </w:t>
+        <w:t xml:space="preserve">Expenses incurred </w:t>
+      </w:r>
+      <w:r>
+        <w:rPr>
+          <w:sz w:val="24"/>
+        </w:rPr>
+        <w:t>on &lt;Agricultural Expenses&gt;</w:t>
+      </w:r>
+      <w:r>
+        <w:rPr>
+          <w:sz w:val="24"/>
+        </w:rPr>
+        <w:t xml:space="preserve">. </w:t>
       </w:r>
     </w:p>
     <w:p>
@@ -6162,7 +6013,6 @@
         <w:rPr>
           <w:sz w:val="24"/>
         </w:rPr>
-        <w:lastRenderedPageBreak/>
         <w:t xml:space="preserve">A report on gardening and other details received from </w:t>
       </w:r>
       <w:r>
@@ -6252,55 +6102,7 @@
           <w:szCs w:val="24"/>
           <w:lang w:val="en-IN"/>
         </w:rPr>
-        <w:t>Labour</w:t>
-      </w:r>
-      <w:r>
-        <w:rPr>
-          <w:bCs/>
-          <w:sz w:val="24"/>
-          <w:szCs w:val="24"/>
-        </w:rPr>
-        <w:t xml:space="preserve">, </w:t>
-      </w:r>
-      <w:r>
-        <w:rPr>
-          <w:bCs/>
-          <w:sz w:val="24"/>
-          <w:szCs w:val="24"/>
-        </w:rPr>
-        <w:t xml:space="preserve">and </w:t>
-      </w:r>
-      <w:r>
-        <w:rPr>
-          <w:bCs/>
-          <w:sz w:val="24"/>
-          <w:szCs w:val="24"/>
-        </w:rPr>
-        <w:t xml:space="preserve">purchase of </w:t>
-      </w:r>
-      <w:r>
-        <w:rPr>
-          <w:bCs/>
-          <w:sz w:val="24"/>
-          <w:szCs w:val="24"/>
-        </w:rPr>
-        <w:t>flower seeds, flowers</w:t>
-      </w:r>
-      <w:r>
-        <w:rPr>
-          <w:bCs/>
-          <w:sz w:val="24"/>
-          <w:szCs w:val="24"/>
-        </w:rPr>
-        <w:t>,</w:t>
-      </w:r>
-      <w:r>
-        <w:rPr>
-          <w:bCs/>
-          <w:sz w:val="24"/>
-          <w:szCs w:val="24"/>
-        </w:rPr>
-        <w:t xml:space="preserve"> and flower pots.</w:t>
+        <w:t>&lt;Garden expenses&gt;</w:t>
       </w:r>
     </w:p>
     <w:p>
@@ -6643,7 +6445,7 @@
           <w:sz w:val="24"/>
           <w:szCs w:val="24"/>
         </w:rPr>
-        <w:t>&lt;Trustee 1&gt;</w:t>
+        <w:t>&lt;Trustee 1 aka Managing Trustee&gt;</w:t>
       </w:r>
       <w:r>
         <w:rPr>
@@ -7534,7 +7336,6 @@
           <w:sz w:val="24"/>
           <w:szCs w:val="24"/>
         </w:rPr>
-        <w:lastRenderedPageBreak/>
         <w:t>Investment made in</w:t>
       </w:r>
     </w:p>
@@ -7585,7 +7386,15 @@
           <w:sz w:val="24"/>
           <w:szCs w:val="24"/>
         </w:rPr>
-        <w:t>Corpus, Hospital Endowment, Relief to Poor, Foreign General, Foreign Outlook Endowment Corpus, Foreign Corpus, Foreign Hospital Endowment, Foreign Relief to Poor &gt;</w:t>
+        <w:t xml:space="preserve">Corpus, </w:t>
+      </w:r>
+      <w:r>
+        <w:rPr>
+          <w:sz w:val="24"/>
+          <w:szCs w:val="24"/>
+        </w:rPr>
+        <w:lastRenderedPageBreak/>
+        <w:t>Hospital Endowment, Relief to Poor, Foreign General, Foreign Outlook Endowment Corpus, Foreign Corpus, Foreign Hospital Endowment, Foreign Relief to Poor &gt;</w:t>
       </w:r>
     </w:p>
     <w:p>
@@ -8007,7 +7816,6 @@
           <w:sz w:val="24"/>
           <w:szCs w:val="24"/>
         </w:rPr>
-        <w:lastRenderedPageBreak/>
         <w:t xml:space="preserve">&lt;Building Name&gt; </w:t>
       </w:r>
       <w:r>
@@ -8786,13 +8594,7 @@
         <w:rPr>
           <w:sz w:val="24"/>
         </w:rPr>
-        <w:t>&lt;insert resolution&gt;</w:t>
-      </w:r>
-      <w:r>
-        <w:rPr>
-          <w:sz w:val="24"/>
-        </w:rPr>
-        <w:t>”</w:t>
+        <w:t>&lt;insert resolution&gt;”</w:t>
       </w:r>
     </w:p>
     <w:p>
@@ -8818,8 +8620,6 @@
         </w:rPr>
         <w:t>…&lt;insert additional resolutions as separate points where relevant&gt;</w:t>
       </w:r>
-      <w:bookmarkStart w:id="2" w:name="_GoBack"/>
-      <w:bookmarkEnd w:id="2"/>
     </w:p>
     <w:p>
       <w:pPr>
@@ -8874,7 +8674,6 @@
           <w:sz w:val="24"/>
           <w:szCs w:val="24"/>
         </w:rPr>
-        <w:lastRenderedPageBreak/>
         <w:t>In the absence of any other matter to discuss the meeting ended with a vote of thanks to the Chair.</w:t>
       </w:r>
       <w:r>
@@ -14278,7 +14077,7 @@
 </file>
 
 <file path=customXml/itemProps1.xml><?xml version="1.0" encoding="utf-8"?>
-<ds:datastoreItem xmlns:ds="http://schemas.openxmlformats.org/officeDocument/2006/customXml" ds:itemID="{E72895D7-AC26-4748-B29A-954E250ED408}">
+<ds:datastoreItem xmlns:ds="http://schemas.openxmlformats.org/officeDocument/2006/customXml" ds:itemID="{1BF6BDF5-A8FA-4148-9718-9F14C4674E60}">
   <ds:schemaRefs>
     <ds:schemaRef ds:uri="http://schemas.openxmlformats.org/officeDocument/2006/bibliography"/>
   </ds:schemaRefs>

</xml_diff>